<commit_message>
Update proposal wording to match latest tiny-data evidence
Revise the research proposal document to better align claims and framing with the current DeepMIMO and RADIATE tiny-sample experimental outcomes.

Made-with: Cursor
</commit_message>
<xml_diff>
--- a/Smart Connectivity and Fusion Research Proposal.docx
+++ b/Smart Connectivity and Fusion Research Proposal.docx
@@ -247,7 +247,51 @@
           <w:szCs w:val="19"/>
           <w:shd w:val="clear" w:fill="FFFFFF"/>
         </w:rPr>
-        <w:t>The evolution toward 6G introduces unprecedented requirements for ubiquitous connectivity and sub-centimeter environmental perception, driving the emergence of Integrated Sensing and Communication (ISAC). Concurrently, Semantic Communication reduces bandwidth requirements by transmitting task-relevant "meaning" rather than raw bits. However, realizing a fully integrated 6G architecture remains an open problem due to the modality gap—existing ISAC systems rely primarily on single-modal radio frequency (RF) sensing, which lacks contextual awareness in highly dynamic, occluded environments. This proposal outlines a concise, feasible research plan to develop an Integrated Sensing, Computing, and Semantic Communication (ISCSC) framework for high-mobility 6G edge-IoT networks. By employing an edge-centric architecture utilizing Transformer-based feature alignment and a Mixture-of-Experts (MoE) gating mechanism, the framework dynamically fuses visual optics and RF Channel State Information (CSI). This facilitates adaptive semantic resource slicing, maximizing transmission rates while rigorously preserving the Cramér-Rao Bound (CRB) for sensing accuracy. Preliminary experimental results strongly demonstrate the framework's superior reliability and efficiency.</w:t>
+        <w:t xml:space="preserve">The evolution toward 6G introduces unprecedented requirements for ubiquitous connectivity and sub-centimeter environmental perception, driving the emergence of Integrated Sensing and Communication (ISAC). Concurrently, Semantic Communication reduces bandwidth requirements by transmitting task-relevant "meaning" rather than raw bits. However, realizing a fully integrated 6G architecture remains an open problem due to the modality gap—existing ISAC systems rely primarily on single-modal radio frequency (RF) sensing, which lacks contextual awareness in highly dynamic, occluded environments. This proposal outlines a concise, feasible research plan to develop an Integrated Sensing, Computing, and Semantic Communication (ISCSC) framework for high-mobility 6G edge-IoT networks. By employing an edge-centric architecture utilizing Transformer-based feature alignment and a Mixture-of-Experts (MoE) gating mechanism, the framework dynamically fuses visual optics and RF Channel State Information (CSI). This facilitates adaptive semantic resource slicing, maximizing transmission rates </w:t>
+      </w:r>
+      <w:r>
+        <w:rPr>
+          <w:rFonts w:hint="eastAsia" w:ascii="sans-serif" w:hAnsi="sans-serif" w:eastAsia="sans-serif" w:cs="sans-serif"/>
+          <w:i w:val="0"/>
+          <w:iCs w:val="0"/>
+          <w:caps w:val="0"/>
+          <w:color w:val="1F1F1F"/>
+          <w:spacing w:val="0"/>
+          <w:sz w:val="19"/>
+          <w:szCs w:val="19"/>
+          <w:shd w:val="clear" w:fill="FFFFFF"/>
+        </w:rPr>
+        <w:t>with the long-term objective of incorporating CRB-aware sensing constraints.</w:t>
+      </w:r>
+      <w:bookmarkStart w:id="0" w:name="_GoBack"/>
+      <w:bookmarkEnd w:id="0"/>
+      <w:r>
+        <w:rPr>
+          <w:rFonts w:ascii="sans-serif" w:hAnsi="sans-serif" w:eastAsia="sans-serif" w:cs="sans-serif"/>
+          <w:i w:val="0"/>
+          <w:iCs w:val="0"/>
+          <w:caps w:val="0"/>
+          <w:color w:val="1F1F1F"/>
+          <w:spacing w:val="0"/>
+          <w:sz w:val="19"/>
+          <w:szCs w:val="19"/>
+          <w:shd w:val="clear" w:fill="FFFFFF"/>
+        </w:rPr>
+        <w:t xml:space="preserve">. </w:t>
+      </w:r>
+      <w:r>
+        <w:rPr>
+          <w:rFonts w:hint="eastAsia" w:ascii="sans-serif" w:hAnsi="sans-serif" w:eastAsia="sans-serif" w:cs="sans-serif"/>
+          <w:i w:val="0"/>
+          <w:iCs w:val="0"/>
+          <w:caps w:val="0"/>
+          <w:color w:val="1F1F1F"/>
+          <w:spacing w:val="0"/>
+          <w:sz w:val="19"/>
+          <w:szCs w:val="19"/>
+          <w:shd w:val="clear" w:fill="FFFFFF"/>
+        </w:rPr>
+        <w:t>Preliminary small-scale experiments provide partial evidence for the feasibility of channel-aware semantic resource slicing. However, current radar-camera fusion results on a tiny real-world foggy sample do not yet demonstrate consistent superiority over camera-only perception, motivating further validation on larger multimodal datasets.</w:t>
       </w:r>
     </w:p>
     <w:p>
@@ -5675,7 +5719,7 @@
           <w:szCs w:val="19"/>
           <w:shd w:val="clear" w:fill="FFFFFF"/>
         </w:rPr>
-        <w:t>file to this proposal. The scenario modeled a 64-antenna ULA edge server serving mobile vehicles under near-field mmWave propagation (28 GHz).</w:t>
+        <w:t>file to this proposal. The experiments consist of two small-scale public-data evaluations: a DeepMIMO channel-aware semantic slicing proxy experiment and a RADIATE tiny foggy radar-camera perception experiment.</w:t>
       </w:r>
     </w:p>
     <w:p>
@@ -5720,568 +5764,11 @@
           <w:szCs w:val="19"/>
           <w:shd w:val="clear" w:fill="FFFFFF"/>
         </w:rPr>
-        <w:t xml:space="preserve"> The framework was tested for Semantic Symbol Error Rate (SER) across various Signal-to-Noise Ratios (SNR).</w:t>
+        <w:t xml:space="preserve"> The channel-aware resource slicing component was evaluated using a SER proxy derived from DeepMIMO ray-tracing channel quality.</w:t>
       </w:r>
     </w:p>
-    <w:tbl>
-      <w:tblPr>
-        <w:tblStyle w:val="5"/>
-        <w:tblW w:w="0" w:type="auto"/>
-        <w:tblInd w:w="0" w:type="dxa"/>
-        <w:tblBorders>
-          <w:top w:val="single" w:color="auto" w:sz="4" w:space="0"/>
-          <w:left w:val="single" w:color="auto" w:sz="4" w:space="0"/>
-          <w:bottom w:val="single" w:color="auto" w:sz="4" w:space="0"/>
-          <w:right w:val="single" w:color="auto" w:sz="4" w:space="0"/>
-          <w:insideH w:val="single" w:color="auto" w:sz="4" w:space="0"/>
-          <w:insideV w:val="single" w:color="auto" w:sz="4" w:space="0"/>
-        </w:tblBorders>
-        <w:tblLayout w:type="autofit"/>
-        <w:tblCellMar>
-          <w:left w:w="108" w:type="dxa"/>
-          <w:right w:w="108" w:type="dxa"/>
-        </w:tblCellMar>
-      </w:tblPr>
-      <w:tblGrid>
-        <w:gridCol w:w="2840"/>
-        <w:gridCol w:w="2841"/>
-        <w:gridCol w:w="2841"/>
-      </w:tblGrid>
-      <w:tr>
-        <w:tblPrEx>
-          <w:tblBorders>
-            <w:top w:val="single" w:color="auto" w:sz="4" w:space="0"/>
-            <w:left w:val="single" w:color="auto" w:sz="4" w:space="0"/>
-            <w:bottom w:val="single" w:color="auto" w:sz="4" w:space="0"/>
-            <w:right w:val="single" w:color="auto" w:sz="4" w:space="0"/>
-            <w:insideH w:val="single" w:color="auto" w:sz="4" w:space="0"/>
-            <w:insideV w:val="single" w:color="auto" w:sz="4" w:space="0"/>
-          </w:tblBorders>
-          <w:tblCellMar>
-            <w:left w:w="108" w:type="dxa"/>
-            <w:right w:w="108" w:type="dxa"/>
-          </w:tblCellMar>
-        </w:tblPrEx>
-        <w:tc>
-          <w:tcPr>
-            <w:tcW w:w="2840" w:type="dxa"/>
-          </w:tcPr>
-          <w:p>
-            <w:pPr>
-              <w:rPr>
-                <w:rFonts w:hint="default" w:ascii="sans-serif" w:hAnsi="sans-serif" w:eastAsia="sans-serif" w:cs="sans-serif"/>
-                <w:i w:val="0"/>
-                <w:iCs w:val="0"/>
-                <w:caps w:val="0"/>
-                <w:color w:val="1F1F1F"/>
-                <w:spacing w:val="0"/>
-                <w:sz w:val="19"/>
-                <w:szCs w:val="19"/>
-                <w:shd w:val="clear" w:fill="FFFFFF"/>
-                <w:vertAlign w:val="baseline"/>
-                <w:lang w:val="en-US" w:eastAsia="zh-CN"/>
-              </w:rPr>
-            </w:pPr>
-            <w:r>
-              <w:rPr>
-                <w:rFonts w:ascii="sans-serif" w:hAnsi="sans-serif" w:eastAsia="sans-serif" w:cs="sans-serif"/>
-                <w:i w:val="0"/>
-                <w:iCs w:val="0"/>
-                <w:caps w:val="0"/>
-                <w:color w:val="1F1F1F"/>
-                <w:spacing w:val="0"/>
-                <w:sz w:val="19"/>
-                <w:szCs w:val="19"/>
-                <w:shd w:val="clear" w:fill="FFFFFF"/>
-              </w:rPr>
-              <w:t>SNR (dB)</w:t>
-            </w:r>
-            <w:r>
-              <w:rPr>
-                <w:rFonts w:hint="default" w:ascii="sans-serif" w:hAnsi="sans-serif" w:eastAsia="sans-serif" w:cs="sans-serif"/>
-                <w:i w:val="0"/>
-                <w:iCs w:val="0"/>
-                <w:caps w:val="0"/>
-                <w:color w:val="1F1F1F"/>
-                <w:spacing w:val="0"/>
-                <w:sz w:val="19"/>
-                <w:szCs w:val="19"/>
-                <w:shd w:val="clear" w:fill="FFFFFF"/>
-                <w:lang w:eastAsia="zh-CN"/>
-              </w:rPr>
-              <w:t> </w:t>
-            </w:r>
-          </w:p>
-        </w:tc>
-        <w:tc>
-          <w:tcPr>
-            <w:tcW w:w="2841" w:type="dxa"/>
-          </w:tcPr>
-          <w:p>
-            <w:pPr>
-              <w:rPr>
-                <w:rFonts w:hint="default" w:ascii="sans-serif" w:hAnsi="sans-serif" w:eastAsia="sans-serif" w:cs="sans-serif"/>
-                <w:i w:val="0"/>
-                <w:iCs w:val="0"/>
-                <w:caps w:val="0"/>
-                <w:color w:val="1F1F1F"/>
-                <w:spacing w:val="0"/>
-                <w:sz w:val="19"/>
-                <w:szCs w:val="19"/>
-                <w:shd w:val="clear" w:fill="FFFFFF"/>
-                <w:vertAlign w:val="baseline"/>
-                <w:lang w:val="en-US" w:eastAsia="zh-CN"/>
-              </w:rPr>
-            </w:pPr>
-            <w:r>
-              <w:rPr>
-                <w:rFonts w:hint="default" w:ascii="sans-serif" w:hAnsi="sans-serif" w:eastAsia="sans-serif" w:cs="sans-serif"/>
-                <w:i w:val="0"/>
-                <w:iCs w:val="0"/>
-                <w:caps w:val="0"/>
-                <w:color w:val="1F1F1F"/>
-                <w:spacing w:val="0"/>
-                <w:sz w:val="19"/>
-                <w:szCs w:val="19"/>
-                <w:shd w:val="clear" w:fill="FFFFFF"/>
-                <w:vertAlign w:val="baseline"/>
-                <w:lang w:val="en-US" w:eastAsia="zh-CN"/>
-              </w:rPr>
-              <w:t>Baseline: VGAE-ISAC</w:t>
-            </w:r>
-          </w:p>
-        </w:tc>
-        <w:tc>
-          <w:tcPr>
-            <w:tcW w:w="2841" w:type="dxa"/>
-          </w:tcPr>
-          <w:p>
-            <w:pPr>
-              <w:rPr>
-                <w:rFonts w:hint="default" w:ascii="sans-serif" w:hAnsi="sans-serif" w:eastAsia="sans-serif" w:cs="sans-serif"/>
-                <w:i w:val="0"/>
-                <w:iCs w:val="0"/>
-                <w:caps w:val="0"/>
-                <w:color w:val="1F1F1F"/>
-                <w:spacing w:val="0"/>
-                <w:sz w:val="19"/>
-                <w:szCs w:val="19"/>
-                <w:shd w:val="clear" w:fill="FFFFFF"/>
-                <w:vertAlign w:val="baseline"/>
-                <w:lang w:val="en-US" w:eastAsia="zh-CN"/>
-              </w:rPr>
-            </w:pPr>
-            <w:r>
-              <w:rPr>
-                <w:rFonts w:ascii="sans-serif" w:hAnsi="sans-serif" w:eastAsia="sans-serif" w:cs="sans-serif"/>
-                <w:i w:val="0"/>
-                <w:iCs w:val="0"/>
-                <w:caps w:val="0"/>
-                <w:color w:val="1F1F1F"/>
-                <w:spacing w:val="0"/>
-                <w:sz w:val="19"/>
-                <w:szCs w:val="19"/>
-                <w:shd w:val="clear" w:fill="FFFFFF"/>
-              </w:rPr>
-              <w:t>Proposed: ISCSC-MoE</w:t>
-            </w:r>
-          </w:p>
-        </w:tc>
-      </w:tr>
-      <w:tr>
-        <w:tblPrEx>
-          <w:tblBorders>
-            <w:top w:val="single" w:color="auto" w:sz="4" w:space="0"/>
-            <w:left w:val="single" w:color="auto" w:sz="4" w:space="0"/>
-            <w:bottom w:val="single" w:color="auto" w:sz="4" w:space="0"/>
-            <w:right w:val="single" w:color="auto" w:sz="4" w:space="0"/>
-            <w:insideH w:val="single" w:color="auto" w:sz="4" w:space="0"/>
-            <w:insideV w:val="single" w:color="auto" w:sz="4" w:space="0"/>
-          </w:tblBorders>
-          <w:tblCellMar>
-            <w:left w:w="108" w:type="dxa"/>
-            <w:right w:w="108" w:type="dxa"/>
-          </w:tblCellMar>
-        </w:tblPrEx>
-        <w:tc>
-          <w:tcPr>
-            <w:tcW w:w="2840" w:type="dxa"/>
-          </w:tcPr>
-          <w:p>
-            <w:pPr>
-              <w:rPr>
-                <w:rFonts w:hint="default" w:ascii="sans-serif" w:hAnsi="sans-serif" w:eastAsia="sans-serif" w:cs="sans-serif"/>
-                <w:i w:val="0"/>
-                <w:iCs w:val="0"/>
-                <w:caps w:val="0"/>
-                <w:color w:val="1F1F1F"/>
-                <w:spacing w:val="0"/>
-                <w:sz w:val="19"/>
-                <w:szCs w:val="19"/>
-                <w:shd w:val="clear" w:fill="FFFFFF"/>
-                <w:vertAlign w:val="baseline"/>
-                <w:lang w:val="en-US" w:eastAsia="zh-CN"/>
-              </w:rPr>
-            </w:pPr>
-            <w:r>
-              <w:rPr>
-                <w:rFonts w:hint="eastAsia" w:ascii="sans-serif" w:hAnsi="sans-serif" w:eastAsia="sans-serif" w:cs="sans-serif"/>
-                <w:i w:val="0"/>
-                <w:iCs w:val="0"/>
-                <w:caps w:val="0"/>
-                <w:color w:val="1F1F1F"/>
-                <w:spacing w:val="0"/>
-                <w:sz w:val="19"/>
-                <w:szCs w:val="19"/>
-                <w:shd w:val="clear" w:fill="FFFFFF"/>
-                <w:vertAlign w:val="baseline"/>
-                <w:lang w:val="en-US" w:eastAsia="zh-CN"/>
-              </w:rPr>
-              <w:t>-6</w:t>
-            </w:r>
-          </w:p>
-        </w:tc>
-        <w:tc>
-          <w:tcPr>
-            <w:tcW w:w="2841" w:type="dxa"/>
-          </w:tcPr>
-          <w:p>
-            <w:pPr>
-              <w:rPr>
-                <w:rFonts w:hint="default" w:ascii="sans-serif" w:hAnsi="sans-serif" w:eastAsia="sans-serif" w:cs="sans-serif"/>
-                <w:i w:val="0"/>
-                <w:iCs w:val="0"/>
-                <w:caps w:val="0"/>
-                <w:color w:val="1F1F1F"/>
-                <w:spacing w:val="0"/>
-                <w:sz w:val="19"/>
-                <w:szCs w:val="19"/>
-                <w:shd w:val="clear" w:fill="FFFFFF"/>
-                <w:vertAlign w:val="baseline"/>
-                <w:lang w:val="en-US" w:eastAsia="zh-CN"/>
-              </w:rPr>
-            </w:pPr>
-            <w:r>
-              <w:rPr>
-                <w:rFonts w:hint="eastAsia" w:ascii="sans-serif" w:hAnsi="sans-serif" w:eastAsia="sans-serif" w:cs="sans-serif"/>
-                <w:i w:val="0"/>
-                <w:iCs w:val="0"/>
-                <w:caps w:val="0"/>
-                <w:color w:val="1F1F1F"/>
-                <w:spacing w:val="0"/>
-                <w:sz w:val="19"/>
-                <w:szCs w:val="19"/>
-                <w:shd w:val="clear" w:fill="FFFFFF"/>
-                <w:vertAlign w:val="baseline"/>
-                <w:lang w:val="en-US" w:eastAsia="zh-CN"/>
-              </w:rPr>
-              <w:t>0.4210</w:t>
-            </w:r>
-          </w:p>
-        </w:tc>
-        <w:tc>
-          <w:tcPr>
-            <w:tcW w:w="2841" w:type="dxa"/>
-          </w:tcPr>
-          <w:p>
-            <w:pPr>
-              <w:rPr>
-                <w:rFonts w:hint="default" w:ascii="sans-serif" w:hAnsi="sans-serif" w:eastAsia="sans-serif" w:cs="sans-serif"/>
-                <w:i w:val="0"/>
-                <w:iCs w:val="0"/>
-                <w:caps w:val="0"/>
-                <w:color w:val="1F1F1F"/>
-                <w:spacing w:val="0"/>
-                <w:sz w:val="19"/>
-                <w:szCs w:val="19"/>
-                <w:shd w:val="clear" w:fill="FFFFFF"/>
-                <w:vertAlign w:val="baseline"/>
-                <w:lang w:val="en-US" w:eastAsia="zh-CN"/>
-              </w:rPr>
-            </w:pPr>
-            <w:r>
-              <w:rPr>
-                <w:rFonts w:hint="eastAsia" w:ascii="sans-serif" w:hAnsi="sans-serif" w:eastAsia="sans-serif" w:cs="sans-serif"/>
-                <w:i w:val="0"/>
-                <w:iCs w:val="0"/>
-                <w:caps w:val="0"/>
-                <w:color w:val="1F1F1F"/>
-                <w:spacing w:val="0"/>
-                <w:sz w:val="19"/>
-                <w:szCs w:val="19"/>
-                <w:shd w:val="clear" w:fill="FFFFFF"/>
-                <w:vertAlign w:val="baseline"/>
-                <w:lang w:val="en-US" w:eastAsia="zh-CN"/>
-              </w:rPr>
-              <w:t>0.2015</w:t>
-            </w:r>
-          </w:p>
-        </w:tc>
-      </w:tr>
-      <w:tr>
-        <w:tblPrEx>
-          <w:tblBorders>
-            <w:top w:val="single" w:color="auto" w:sz="4" w:space="0"/>
-            <w:left w:val="single" w:color="auto" w:sz="4" w:space="0"/>
-            <w:bottom w:val="single" w:color="auto" w:sz="4" w:space="0"/>
-            <w:right w:val="single" w:color="auto" w:sz="4" w:space="0"/>
-            <w:insideH w:val="single" w:color="auto" w:sz="4" w:space="0"/>
-            <w:insideV w:val="single" w:color="auto" w:sz="4" w:space="0"/>
-          </w:tblBorders>
-          <w:tblCellMar>
-            <w:left w:w="108" w:type="dxa"/>
-            <w:right w:w="108" w:type="dxa"/>
-          </w:tblCellMar>
-        </w:tblPrEx>
-        <w:tc>
-          <w:tcPr>
-            <w:tcW w:w="2840" w:type="dxa"/>
-          </w:tcPr>
-          <w:p>
-            <w:pPr>
-              <w:rPr>
-                <w:rFonts w:hint="default" w:ascii="sans-serif" w:hAnsi="sans-serif" w:eastAsia="sans-serif" w:cs="sans-serif"/>
-                <w:i w:val="0"/>
-                <w:iCs w:val="0"/>
-                <w:caps w:val="0"/>
-                <w:color w:val="1F1F1F"/>
-                <w:spacing w:val="0"/>
-                <w:sz w:val="19"/>
-                <w:szCs w:val="19"/>
-                <w:shd w:val="clear" w:fill="FFFFFF"/>
-                <w:vertAlign w:val="baseline"/>
-                <w:lang w:val="en-US" w:eastAsia="zh-CN"/>
-              </w:rPr>
-            </w:pPr>
-            <w:r>
-              <w:rPr>
-                <w:rFonts w:hint="eastAsia" w:ascii="sans-serif" w:hAnsi="sans-serif" w:eastAsia="sans-serif" w:cs="sans-serif"/>
-                <w:i w:val="0"/>
-                <w:iCs w:val="0"/>
-                <w:caps w:val="0"/>
-                <w:color w:val="1F1F1F"/>
-                <w:spacing w:val="0"/>
-                <w:sz w:val="19"/>
-                <w:szCs w:val="19"/>
-                <w:shd w:val="clear" w:fill="FFFFFF"/>
-                <w:vertAlign w:val="baseline"/>
-                <w:lang w:val="en-US" w:eastAsia="zh-CN"/>
-              </w:rPr>
-              <w:t>2</w:t>
-            </w:r>
-          </w:p>
-        </w:tc>
-        <w:tc>
-          <w:tcPr>
-            <w:tcW w:w="2841" w:type="dxa"/>
-          </w:tcPr>
-          <w:p>
-            <w:pPr>
-              <w:rPr>
-                <w:rFonts w:hint="default" w:ascii="sans-serif" w:hAnsi="sans-serif" w:eastAsia="sans-serif" w:cs="sans-serif"/>
-                <w:i w:val="0"/>
-                <w:iCs w:val="0"/>
-                <w:caps w:val="0"/>
-                <w:color w:val="1F1F1F"/>
-                <w:spacing w:val="0"/>
-                <w:sz w:val="19"/>
-                <w:szCs w:val="19"/>
-                <w:shd w:val="clear" w:fill="FFFFFF"/>
-                <w:vertAlign w:val="baseline"/>
-                <w:lang w:val="en-US" w:eastAsia="zh-CN"/>
-              </w:rPr>
-            </w:pPr>
-            <w:r>
-              <w:rPr>
-                <w:rFonts w:hint="eastAsia" w:ascii="sans-serif" w:hAnsi="sans-serif" w:eastAsia="sans-serif" w:cs="sans-serif"/>
-                <w:i w:val="0"/>
-                <w:iCs w:val="0"/>
-                <w:caps w:val="0"/>
-                <w:color w:val="1F1F1F"/>
-                <w:spacing w:val="0"/>
-                <w:sz w:val="19"/>
-                <w:szCs w:val="19"/>
-                <w:shd w:val="clear" w:fill="FFFFFF"/>
-                <w:vertAlign w:val="baseline"/>
-                <w:lang w:val="en-US" w:eastAsia="zh-CN"/>
-              </w:rPr>
-              <w:t>0.0810</w:t>
-            </w:r>
-          </w:p>
-        </w:tc>
-        <w:tc>
-          <w:tcPr>
-            <w:tcW w:w="2841" w:type="dxa"/>
-          </w:tcPr>
-          <w:p>
-            <w:pPr>
-              <w:rPr>
-                <w:rFonts w:hint="default" w:ascii="sans-serif" w:hAnsi="sans-serif" w:eastAsia="sans-serif" w:cs="sans-serif"/>
-                <w:i w:val="0"/>
-                <w:iCs w:val="0"/>
-                <w:caps w:val="0"/>
-                <w:color w:val="1F1F1F"/>
-                <w:spacing w:val="0"/>
-                <w:sz w:val="19"/>
-                <w:szCs w:val="19"/>
-                <w:shd w:val="clear" w:fill="FFFFFF"/>
-                <w:vertAlign w:val="baseline"/>
-                <w:lang w:val="en-US" w:eastAsia="zh-CN"/>
-              </w:rPr>
-            </w:pPr>
-            <w:r>
-              <w:rPr>
-                <w:rFonts w:hint="eastAsia" w:ascii="sans-serif" w:hAnsi="sans-serif" w:eastAsia="sans-serif" w:cs="sans-serif"/>
-                <w:i w:val="0"/>
-                <w:iCs w:val="0"/>
-                <w:caps w:val="0"/>
-                <w:color w:val="1F1F1F"/>
-                <w:spacing w:val="0"/>
-                <w:sz w:val="19"/>
-                <w:szCs w:val="19"/>
-                <w:shd w:val="clear" w:fill="FFFFFF"/>
-                <w:vertAlign w:val="baseline"/>
-                <w:lang w:val="en-US" w:eastAsia="zh-CN"/>
-              </w:rPr>
-              <w:t>0.0210</w:t>
-            </w:r>
-          </w:p>
-        </w:tc>
-      </w:tr>
-      <w:tr>
-        <w:tblPrEx>
-          <w:tblBorders>
-            <w:top w:val="single" w:color="auto" w:sz="4" w:space="0"/>
-            <w:left w:val="single" w:color="auto" w:sz="4" w:space="0"/>
-            <w:bottom w:val="single" w:color="auto" w:sz="4" w:space="0"/>
-            <w:right w:val="single" w:color="auto" w:sz="4" w:space="0"/>
-            <w:insideH w:val="single" w:color="auto" w:sz="4" w:space="0"/>
-            <w:insideV w:val="single" w:color="auto" w:sz="4" w:space="0"/>
-          </w:tblBorders>
-          <w:tblCellMar>
-            <w:left w:w="108" w:type="dxa"/>
-            <w:right w:w="108" w:type="dxa"/>
-          </w:tblCellMar>
-        </w:tblPrEx>
-        <w:tc>
-          <w:tcPr>
-            <w:tcW w:w="2840" w:type="dxa"/>
-          </w:tcPr>
-          <w:p>
-            <w:pPr>
-              <w:rPr>
-                <w:rFonts w:hint="default" w:ascii="sans-serif" w:hAnsi="sans-serif" w:eastAsia="sans-serif" w:cs="sans-serif"/>
-                <w:i w:val="0"/>
-                <w:iCs w:val="0"/>
-                <w:caps w:val="0"/>
-                <w:color w:val="1F1F1F"/>
-                <w:spacing w:val="0"/>
-                <w:sz w:val="19"/>
-                <w:szCs w:val="19"/>
-                <w:shd w:val="clear" w:fill="FFFFFF"/>
-                <w:vertAlign w:val="baseline"/>
-                <w:lang w:val="en-US" w:eastAsia="zh-CN"/>
-              </w:rPr>
-            </w:pPr>
-            <w:r>
-              <w:rPr>
-                <w:rFonts w:hint="eastAsia" w:ascii="sans-serif" w:hAnsi="sans-serif" w:eastAsia="sans-serif" w:cs="sans-serif"/>
-                <w:i w:val="0"/>
-                <w:iCs w:val="0"/>
-                <w:caps w:val="0"/>
-                <w:color w:val="1F1F1F"/>
-                <w:spacing w:val="0"/>
-                <w:sz w:val="19"/>
-                <w:szCs w:val="19"/>
-                <w:shd w:val="clear" w:fill="FFFFFF"/>
-                <w:vertAlign w:val="baseline"/>
-                <w:lang w:val="en-US" w:eastAsia="zh-CN"/>
-              </w:rPr>
-              <w:t>10</w:t>
-            </w:r>
-          </w:p>
-        </w:tc>
-        <w:tc>
-          <w:tcPr>
-            <w:tcW w:w="2841" w:type="dxa"/>
-          </w:tcPr>
-          <w:p>
-            <w:pPr>
-              <w:rPr>
-                <w:rFonts w:hint="default" w:ascii="sans-serif" w:hAnsi="sans-serif" w:eastAsia="sans-serif" w:cs="sans-serif"/>
-                <w:i w:val="0"/>
-                <w:iCs w:val="0"/>
-                <w:caps w:val="0"/>
-                <w:color w:val="1F1F1F"/>
-                <w:spacing w:val="0"/>
-                <w:sz w:val="19"/>
-                <w:szCs w:val="19"/>
-                <w:shd w:val="clear" w:fill="FFFFFF"/>
-                <w:vertAlign w:val="baseline"/>
-                <w:lang w:val="en-US" w:eastAsia="zh-CN"/>
-              </w:rPr>
-            </w:pPr>
-            <w:r>
-              <w:rPr>
-                <w:rFonts w:hint="eastAsia" w:ascii="sans-serif" w:hAnsi="sans-serif" w:eastAsia="sans-serif" w:cs="sans-serif"/>
-                <w:i w:val="0"/>
-                <w:iCs w:val="0"/>
-                <w:caps w:val="0"/>
-                <w:color w:val="1F1F1F"/>
-                <w:spacing w:val="0"/>
-                <w:sz w:val="19"/>
-                <w:szCs w:val="19"/>
-                <w:shd w:val="clear" w:fill="FFFFFF"/>
-                <w:vertAlign w:val="baseline"/>
-                <w:lang w:val="en-US" w:eastAsia="zh-CN"/>
-              </w:rPr>
-              <w:t>0.0040</w:t>
-            </w:r>
-          </w:p>
-        </w:tc>
-        <w:tc>
-          <w:tcPr>
-            <w:tcW w:w="2841" w:type="dxa"/>
-          </w:tcPr>
-          <w:p>
-            <w:pPr>
-              <w:rPr>
-                <w:rFonts w:hint="default" w:ascii="sans-serif" w:hAnsi="sans-serif" w:eastAsia="sans-serif" w:cs="sans-serif"/>
-                <w:i w:val="0"/>
-                <w:iCs w:val="0"/>
-                <w:caps w:val="0"/>
-                <w:color w:val="1F1F1F"/>
-                <w:spacing w:val="0"/>
-                <w:sz w:val="19"/>
-                <w:szCs w:val="19"/>
-                <w:shd w:val="clear" w:fill="FFFFFF"/>
-                <w:vertAlign w:val="baseline"/>
-                <w:lang w:val="en-US" w:eastAsia="zh-CN"/>
-              </w:rPr>
-            </w:pPr>
-            <w:r>
-              <w:rPr>
-                <w:rFonts w:hint="eastAsia" w:ascii="sans-serif" w:hAnsi="sans-serif" w:eastAsia="sans-serif" w:cs="sans-serif"/>
-                <w:i w:val="0"/>
-                <w:iCs w:val="0"/>
-                <w:caps w:val="0"/>
-                <w:color w:val="1F1F1F"/>
-                <w:spacing w:val="0"/>
-                <w:sz w:val="19"/>
-                <w:szCs w:val="19"/>
-                <w:shd w:val="clear" w:fill="FFFFFF"/>
-                <w:vertAlign w:val="baseline"/>
-                <w:lang w:val="en-US" w:eastAsia="zh-CN"/>
-              </w:rPr>
-              <w:t>0.0008</w:t>
-            </w:r>
-          </w:p>
-        </w:tc>
-      </w:tr>
-    </w:tbl>
     <w:p>
       <w:pPr>
-        <w:jc w:val="center"/>
         <w:rPr>
           <w:rFonts w:hint="default" w:ascii="sans-serif" w:hAnsi="sans-serif" w:eastAsia="sans-serif" w:cs="sans-serif"/>
           <w:i w:val="0"/>
@@ -6305,8 +5792,99 @@
           <w:sz w:val="19"/>
           <w:szCs w:val="19"/>
           <w:shd w:val="clear" w:fill="FFFFFF"/>
-        </w:rPr>
-        <w:t>Table 1: Semantic Symbol Error Rate evaluated against physical SNR</w:t>
+          <w:lang w:val="en-US" w:eastAsia="zh-CN"/>
+        </w:rPr>
+        <w:t>DeepMIMO channel-aware slicing experiment:</w:t>
+      </w:r>
+    </w:p>
+    <w:p>
+      <w:pPr>
+        <w:rPr>
+          <w:rFonts w:hint="default" w:ascii="sans-serif" w:hAnsi="sans-serif" w:eastAsia="sans-serif" w:cs="sans-serif"/>
+          <w:i w:val="0"/>
+          <w:iCs w:val="0"/>
+          <w:caps w:val="0"/>
+          <w:color w:val="1F1F1F"/>
+          <w:spacing w:val="0"/>
+          <w:sz w:val="19"/>
+          <w:szCs w:val="19"/>
+          <w:shd w:val="clear" w:fill="FFFFFF"/>
+        </w:rPr>
+      </w:pPr>
+      <w:r>
+        <w:rPr>
+          <w:rFonts w:hint="default" w:ascii="sans-serif" w:hAnsi="sans-serif" w:eastAsia="sans-serif" w:cs="sans-serif"/>
+          <w:i w:val="0"/>
+          <w:iCs w:val="0"/>
+          <w:caps w:val="0"/>
+          <w:color w:val="1F1F1F"/>
+          <w:spacing w:val="0"/>
+          <w:sz w:val="19"/>
+          <w:szCs w:val="19"/>
+          <w:shd w:val="clear" w:fill="FFFFFF"/>
+          <w:lang w:val="en-US" w:eastAsia="zh-CN"/>
+        </w:rPr>
+        <w:t>- Fixed policy SER proxy: 0.3904</w:t>
+      </w:r>
+    </w:p>
+    <w:p>
+      <w:pPr>
+        <w:rPr>
+          <w:rFonts w:hint="default" w:ascii="sans-serif" w:hAnsi="sans-serif" w:eastAsia="sans-serif" w:cs="sans-serif"/>
+          <w:i w:val="0"/>
+          <w:iCs w:val="0"/>
+          <w:caps w:val="0"/>
+          <w:color w:val="1F1F1F"/>
+          <w:spacing w:val="0"/>
+          <w:sz w:val="19"/>
+          <w:szCs w:val="19"/>
+          <w:shd w:val="clear" w:fill="FFFFFF"/>
+        </w:rPr>
+      </w:pPr>
+      <w:r>
+        <w:rPr>
+          <w:rFonts w:hint="default" w:ascii="sans-serif" w:hAnsi="sans-serif" w:eastAsia="sans-serif" w:cs="sans-serif"/>
+          <w:i w:val="0"/>
+          <w:iCs w:val="0"/>
+          <w:caps w:val="0"/>
+          <w:color w:val="1F1F1F"/>
+          <w:spacing w:val="0"/>
+          <w:sz w:val="19"/>
+          <w:szCs w:val="19"/>
+          <w:shd w:val="clear" w:fill="FFFFFF"/>
+          <w:lang w:val="en-US" w:eastAsia="zh-CN"/>
+        </w:rPr>
+        <w:t>- Adaptive policy SER proxy: 0.3268</w:t>
+      </w:r>
+    </w:p>
+    <w:p>
+      <w:pPr>
+        <w:rPr>
+          <w:rFonts w:hint="default" w:ascii="sans-serif" w:hAnsi="sans-serif" w:eastAsia="sans-serif" w:cs="sans-serif"/>
+          <w:i w:val="0"/>
+          <w:iCs w:val="0"/>
+          <w:caps w:val="0"/>
+          <w:color w:val="1F1F1F"/>
+          <w:spacing w:val="0"/>
+          <w:sz w:val="19"/>
+          <w:szCs w:val="19"/>
+          <w:shd w:val="clear" w:fill="FFFFFF"/>
+        </w:rPr>
+      </w:pPr>
+      <w:r>
+        <w:rPr>
+          <w:rFonts w:hint="default" w:ascii="sans-serif" w:hAnsi="sans-serif" w:eastAsia="sans-serif" w:cs="sans-serif"/>
+          <w:i w:val="0"/>
+          <w:iCs w:val="0"/>
+          <w:caps w:val="0"/>
+          <w:color w:val="1F1F1F"/>
+          <w:spacing w:val="0"/>
+          <w:sz w:val="19"/>
+          <w:szCs w:val="19"/>
+          <w:shd w:val="clear" w:fill="FFFFFF"/>
+          <w:lang w:val="en-US" w:eastAsia="zh-CN"/>
+        </w:rPr>
+        <w:t>- Relative reduction: 16.28%</w:t>
       </w:r>
     </w:p>
     <w:p>
@@ -6352,659 +5930,37 @@
           <w:szCs w:val="19"/>
           <w:shd w:val="clear" w:fill="FFFFFF"/>
         </w:rPr>
-        <w:t xml:space="preserve"> Tracking accuracy was evaluated using Root Mean Square Error (RMSE) under increasingly hostile environmental conditions.</w:t>
-      </w:r>
-    </w:p>
-    <w:tbl>
-      <w:tblPr>
-        <w:tblStyle w:val="5"/>
-        <w:tblW w:w="0" w:type="auto"/>
-        <w:tblInd w:w="0" w:type="dxa"/>
-        <w:tblBorders>
-          <w:top w:val="single" w:color="auto" w:sz="4" w:space="0"/>
-          <w:left w:val="single" w:color="auto" w:sz="4" w:space="0"/>
-          <w:bottom w:val="single" w:color="auto" w:sz="4" w:space="0"/>
-          <w:right w:val="single" w:color="auto" w:sz="4" w:space="0"/>
-          <w:insideH w:val="single" w:color="auto" w:sz="4" w:space="0"/>
-          <w:insideV w:val="single" w:color="auto" w:sz="4" w:space="0"/>
-        </w:tblBorders>
-        <w:tblLayout w:type="autofit"/>
-        <w:tblCellMar>
-          <w:left w:w="108" w:type="dxa"/>
-          <w:right w:w="108" w:type="dxa"/>
-        </w:tblCellMar>
-      </w:tblPr>
-      <w:tblGrid>
-        <w:gridCol w:w="2216"/>
-        <w:gridCol w:w="2044"/>
-        <w:gridCol w:w="2131"/>
-        <w:gridCol w:w="2131"/>
-      </w:tblGrid>
-      <w:tr>
-        <w:tblPrEx>
-          <w:tblBorders>
-            <w:top w:val="single" w:color="auto" w:sz="4" w:space="0"/>
-            <w:left w:val="single" w:color="auto" w:sz="4" w:space="0"/>
-            <w:bottom w:val="single" w:color="auto" w:sz="4" w:space="0"/>
-            <w:right w:val="single" w:color="auto" w:sz="4" w:space="0"/>
-            <w:insideH w:val="single" w:color="auto" w:sz="4" w:space="0"/>
-            <w:insideV w:val="single" w:color="auto" w:sz="4" w:space="0"/>
-          </w:tblBorders>
-          <w:tblCellMar>
-            <w:left w:w="108" w:type="dxa"/>
-            <w:right w:w="108" w:type="dxa"/>
-          </w:tblCellMar>
-        </w:tblPrEx>
-        <w:tc>
-          <w:tcPr>
-            <w:tcW w:w="2216" w:type="dxa"/>
-          </w:tcPr>
-          <w:p>
-            <w:pPr>
-              <w:jc w:val="both"/>
-              <w:rPr>
-                <w:rFonts w:hint="default" w:ascii="sans-serif" w:hAnsi="sans-serif" w:eastAsia="sans-serif" w:cs="sans-serif"/>
-                <w:i w:val="0"/>
-                <w:iCs w:val="0"/>
-                <w:caps w:val="0"/>
-                <w:color w:val="1F1F1F"/>
-                <w:spacing w:val="0"/>
-                <w:sz w:val="19"/>
-                <w:szCs w:val="19"/>
-                <w:shd w:val="clear" w:fill="FFFFFF"/>
-                <w:vertAlign w:val="baseline"/>
-                <w:lang w:val="en-US" w:eastAsia="zh-CN"/>
-              </w:rPr>
-            </w:pPr>
-            <w:r>
-              <w:rPr>
-                <w:rFonts w:ascii="sans-serif" w:hAnsi="sans-serif" w:eastAsia="sans-serif" w:cs="sans-serif"/>
-                <w:i w:val="0"/>
-                <w:iCs w:val="0"/>
-                <w:caps w:val="0"/>
-                <w:color w:val="1F1F1F"/>
-                <w:spacing w:val="0"/>
-                <w:sz w:val="19"/>
-                <w:szCs w:val="19"/>
-                <w:shd w:val="clear" w:fill="FFFFFF"/>
-              </w:rPr>
-              <w:t>Environmental Dynamics</w:t>
-            </w:r>
-            <w:r>
-              <w:rPr>
-                <w:rFonts w:hint="default" w:ascii="sans-serif" w:hAnsi="sans-serif" w:eastAsia="sans-serif" w:cs="sans-serif"/>
-                <w:i w:val="0"/>
-                <w:iCs w:val="0"/>
-                <w:caps w:val="0"/>
-                <w:color w:val="1F1F1F"/>
-                <w:spacing w:val="0"/>
-                <w:sz w:val="19"/>
-                <w:szCs w:val="19"/>
-                <w:shd w:val="clear" w:fill="FFFFFF"/>
-                <w:lang w:eastAsia="zh-CN"/>
-              </w:rPr>
-              <w:t> </w:t>
-            </w:r>
-          </w:p>
-        </w:tc>
-        <w:tc>
-          <w:tcPr>
-            <w:tcW w:w="2044" w:type="dxa"/>
-          </w:tcPr>
-          <w:p>
-            <w:pPr>
-              <w:jc w:val="both"/>
-              <w:rPr>
-                <w:rFonts w:hint="default" w:ascii="sans-serif" w:hAnsi="sans-serif" w:eastAsia="sans-serif" w:cs="sans-serif"/>
-                <w:i w:val="0"/>
-                <w:iCs w:val="0"/>
-                <w:caps w:val="0"/>
-                <w:color w:val="1F1F1F"/>
-                <w:spacing w:val="0"/>
-                <w:sz w:val="19"/>
-                <w:szCs w:val="19"/>
-                <w:shd w:val="clear" w:fill="FFFFFF"/>
-                <w:vertAlign w:val="baseline"/>
-                <w:lang w:val="en-US" w:eastAsia="zh-CN"/>
-              </w:rPr>
-            </w:pPr>
-            <w:r>
-              <w:rPr>
-                <w:rFonts w:hint="default" w:ascii="sans-serif" w:hAnsi="sans-serif" w:eastAsia="sans-serif" w:cs="sans-serif"/>
-                <w:i w:val="0"/>
-                <w:iCs w:val="0"/>
-                <w:caps w:val="0"/>
-                <w:color w:val="1F1F1F"/>
-                <w:spacing w:val="0"/>
-                <w:sz w:val="19"/>
-                <w:szCs w:val="19"/>
-                <w:shd w:val="clear" w:fill="FFFFFF"/>
-                <w:vertAlign w:val="baseline"/>
-                <w:lang w:val="en-US" w:eastAsia="zh-CN"/>
-              </w:rPr>
-              <w:t>Hybrid ISAC-LSTM</w:t>
-            </w:r>
-          </w:p>
-        </w:tc>
-        <w:tc>
-          <w:tcPr>
-            <w:tcW w:w="2131" w:type="dxa"/>
-          </w:tcPr>
-          <w:p>
-            <w:pPr>
-              <w:jc w:val="both"/>
-              <w:rPr>
-                <w:rFonts w:hint="default" w:ascii="sans-serif" w:hAnsi="sans-serif" w:eastAsia="sans-serif" w:cs="sans-serif"/>
-                <w:i w:val="0"/>
-                <w:iCs w:val="0"/>
-                <w:caps w:val="0"/>
-                <w:color w:val="1F1F1F"/>
-                <w:spacing w:val="0"/>
-                <w:sz w:val="19"/>
-                <w:szCs w:val="19"/>
-                <w:shd w:val="clear" w:fill="FFFFFF"/>
-                <w:vertAlign w:val="baseline"/>
-                <w:lang w:val="en-US" w:eastAsia="zh-CN"/>
-              </w:rPr>
-            </w:pPr>
-            <w:r>
-              <w:rPr>
-                <w:rFonts w:ascii="sans-serif" w:hAnsi="sans-serif" w:eastAsia="sans-serif" w:cs="sans-serif"/>
-                <w:i w:val="0"/>
-                <w:iCs w:val="0"/>
-                <w:caps w:val="0"/>
-                <w:color w:val="1F1F1F"/>
-                <w:spacing w:val="0"/>
-                <w:sz w:val="19"/>
-                <w:szCs w:val="19"/>
-                <w:shd w:val="clear" w:fill="FFFFFF"/>
-              </w:rPr>
-              <w:t>Proposed: ISCSC-MoE</w:t>
-            </w:r>
-          </w:p>
-        </w:tc>
-        <w:tc>
-          <w:tcPr>
-            <w:tcW w:w="2131" w:type="dxa"/>
-          </w:tcPr>
-          <w:p>
-            <w:pPr>
-              <w:jc w:val="both"/>
-              <w:rPr>
-                <w:rFonts w:hint="default" w:ascii="sans-serif" w:hAnsi="sans-serif" w:eastAsia="sans-serif" w:cs="sans-serif"/>
-                <w:i w:val="0"/>
-                <w:iCs w:val="0"/>
-                <w:caps w:val="0"/>
-                <w:color w:val="1F1F1F"/>
-                <w:spacing w:val="0"/>
-                <w:sz w:val="19"/>
-                <w:szCs w:val="19"/>
-                <w:shd w:val="clear" w:fill="FFFFFF"/>
-                <w:vertAlign w:val="baseline"/>
-                <w:lang w:val="en-US" w:eastAsia="zh-CN"/>
-              </w:rPr>
-            </w:pPr>
-            <w:r>
-              <w:rPr>
-                <w:rFonts w:hint="default" w:ascii="sans-serif" w:hAnsi="sans-serif" w:eastAsia="sans-serif" w:cs="sans-serif"/>
-                <w:i w:val="0"/>
-                <w:iCs w:val="0"/>
-                <w:caps w:val="0"/>
-                <w:color w:val="1F1F1F"/>
-                <w:spacing w:val="0"/>
-                <w:sz w:val="19"/>
-                <w:szCs w:val="19"/>
-                <w:shd w:val="clear" w:fill="FFFFFF"/>
-                <w:vertAlign w:val="baseline"/>
-                <w:lang w:val="en-US" w:eastAsia="zh-CN"/>
-              </w:rPr>
-              <w:t>RMSE Reduction</w:t>
-            </w:r>
-          </w:p>
-        </w:tc>
-      </w:tr>
-      <w:tr>
-        <w:tblPrEx>
-          <w:tblBorders>
-            <w:top w:val="single" w:color="auto" w:sz="4" w:space="0"/>
-            <w:left w:val="single" w:color="auto" w:sz="4" w:space="0"/>
-            <w:bottom w:val="single" w:color="auto" w:sz="4" w:space="0"/>
-            <w:right w:val="single" w:color="auto" w:sz="4" w:space="0"/>
-            <w:insideH w:val="single" w:color="auto" w:sz="4" w:space="0"/>
-            <w:insideV w:val="single" w:color="auto" w:sz="4" w:space="0"/>
-          </w:tblBorders>
-          <w:tblCellMar>
-            <w:left w:w="108" w:type="dxa"/>
-            <w:right w:w="108" w:type="dxa"/>
-          </w:tblCellMar>
-        </w:tblPrEx>
-        <w:tc>
-          <w:tcPr>
-            <w:tcW w:w="2216" w:type="dxa"/>
-          </w:tcPr>
-          <w:p>
-            <w:pPr>
-              <w:jc w:val="both"/>
-              <w:rPr>
-                <w:rFonts w:hint="default" w:ascii="sans-serif" w:hAnsi="sans-serif" w:eastAsia="sans-serif" w:cs="sans-serif"/>
-                <w:i w:val="0"/>
-                <w:iCs w:val="0"/>
-                <w:caps w:val="0"/>
-                <w:color w:val="1F1F1F"/>
-                <w:spacing w:val="0"/>
-                <w:sz w:val="19"/>
-                <w:szCs w:val="19"/>
-                <w:shd w:val="clear" w:fill="FFFFFF"/>
-                <w:vertAlign w:val="baseline"/>
-                <w:lang w:val="en-US" w:eastAsia="zh-CN"/>
-              </w:rPr>
-            </w:pPr>
-            <w:r>
-              <w:rPr>
-                <w:rFonts w:ascii="sans-serif" w:hAnsi="sans-serif" w:eastAsia="sans-serif" w:cs="sans-serif"/>
-                <w:i w:val="0"/>
-                <w:iCs w:val="0"/>
-                <w:caps w:val="0"/>
-                <w:color w:val="1F1F1F"/>
-                <w:spacing w:val="0"/>
-                <w:sz w:val="19"/>
-                <w:szCs w:val="19"/>
-                <w:shd w:val="clear" w:fill="FFFFFF"/>
-              </w:rPr>
-              <w:t>Low</w:t>
-            </w:r>
-            <w:r>
-              <w:rPr>
-                <w:rFonts w:hint="eastAsia" w:ascii="sans-serif" w:hAnsi="sans-serif" w:eastAsia="宋体" w:cs="sans-serif"/>
-                <w:i w:val="0"/>
-                <w:iCs w:val="0"/>
-                <w:caps w:val="0"/>
-                <w:color w:val="1F1F1F"/>
-                <w:spacing w:val="0"/>
-                <w:sz w:val="19"/>
-                <w:szCs w:val="19"/>
-                <w:shd w:val="clear" w:fill="FFFFFF"/>
-                <w:lang w:val="en-US" w:eastAsia="zh-CN"/>
-              </w:rPr>
-              <w:t xml:space="preserve"> </w:t>
-            </w:r>
-            <w:r>
-              <w:rPr>
-                <w:rFonts w:ascii="sans-serif" w:hAnsi="sans-serif" w:eastAsia="sans-serif" w:cs="sans-serif"/>
-                <w:i w:val="0"/>
-                <w:iCs w:val="0"/>
-                <w:caps w:val="0"/>
-                <w:color w:val="1F1F1F"/>
-                <w:spacing w:val="0"/>
-                <w:sz w:val="19"/>
-                <w:szCs w:val="19"/>
-                <w:shd w:val="clear" w:fill="FFFFFF"/>
-              </w:rPr>
-              <w:t>Dynamic(Clear LOS)</w:t>
-            </w:r>
-            <w:r>
-              <w:rPr>
-                <w:rFonts w:hint="default" w:ascii="sans-serif" w:hAnsi="sans-serif" w:eastAsia="sans-serif" w:cs="sans-serif"/>
-                <w:i w:val="0"/>
-                <w:iCs w:val="0"/>
-                <w:caps w:val="0"/>
-                <w:color w:val="1F1F1F"/>
-                <w:spacing w:val="0"/>
-                <w:sz w:val="19"/>
-                <w:szCs w:val="19"/>
-                <w:shd w:val="clear" w:fill="FFFFFF"/>
-                <w:lang w:eastAsia="zh-CN"/>
-              </w:rPr>
-              <w:t> </w:t>
-            </w:r>
-          </w:p>
-        </w:tc>
-        <w:tc>
-          <w:tcPr>
-            <w:tcW w:w="2044" w:type="dxa"/>
-          </w:tcPr>
-          <w:p>
-            <w:pPr>
-              <w:jc w:val="both"/>
-              <w:rPr>
-                <w:rFonts w:hint="default" w:ascii="sans-serif" w:hAnsi="sans-serif" w:eastAsia="sans-serif" w:cs="sans-serif"/>
-                <w:i w:val="0"/>
-                <w:iCs w:val="0"/>
-                <w:caps w:val="0"/>
-                <w:color w:val="1F1F1F"/>
-                <w:spacing w:val="0"/>
-                <w:sz w:val="19"/>
-                <w:szCs w:val="19"/>
-                <w:shd w:val="clear" w:fill="FFFFFF"/>
-                <w:vertAlign w:val="baseline"/>
-                <w:lang w:val="en-US" w:eastAsia="zh-CN"/>
-              </w:rPr>
-            </w:pPr>
-            <w:r>
-              <w:rPr>
-                <w:rFonts w:hint="eastAsia" w:ascii="sans-serif" w:hAnsi="sans-serif" w:eastAsia="sans-serif" w:cs="sans-serif"/>
-                <w:i w:val="0"/>
-                <w:iCs w:val="0"/>
-                <w:caps w:val="0"/>
-                <w:color w:val="1F1F1F"/>
-                <w:spacing w:val="0"/>
-                <w:sz w:val="19"/>
-                <w:szCs w:val="19"/>
-                <w:shd w:val="clear" w:fill="FFFFFF"/>
-                <w:vertAlign w:val="baseline"/>
-                <w:lang w:val="en-US" w:eastAsia="zh-CN"/>
-              </w:rPr>
-              <w:t>2.50m</w:t>
-            </w:r>
-          </w:p>
-        </w:tc>
-        <w:tc>
-          <w:tcPr>
-            <w:tcW w:w="2131" w:type="dxa"/>
-          </w:tcPr>
-          <w:p>
-            <w:pPr>
-              <w:jc w:val="both"/>
-              <w:rPr>
-                <w:rFonts w:hint="default" w:ascii="sans-serif" w:hAnsi="sans-serif" w:eastAsia="sans-serif" w:cs="sans-serif"/>
-                <w:i w:val="0"/>
-                <w:iCs w:val="0"/>
-                <w:caps w:val="0"/>
-                <w:color w:val="1F1F1F"/>
-                <w:spacing w:val="0"/>
-                <w:sz w:val="19"/>
-                <w:szCs w:val="19"/>
-                <w:shd w:val="clear" w:fill="FFFFFF"/>
-                <w:vertAlign w:val="baseline"/>
-                <w:lang w:val="en-US" w:eastAsia="zh-CN"/>
-              </w:rPr>
-            </w:pPr>
-            <w:r>
-              <w:rPr>
-                <w:rFonts w:hint="eastAsia" w:ascii="sans-serif" w:hAnsi="sans-serif" w:eastAsia="sans-serif" w:cs="sans-serif"/>
-                <w:i w:val="0"/>
-                <w:iCs w:val="0"/>
-                <w:caps w:val="0"/>
-                <w:color w:val="1F1F1F"/>
-                <w:spacing w:val="0"/>
-                <w:sz w:val="19"/>
-                <w:szCs w:val="19"/>
-                <w:shd w:val="clear" w:fill="FFFFFF"/>
-                <w:vertAlign w:val="baseline"/>
-                <w:lang w:val="en-US" w:eastAsia="zh-CN"/>
-              </w:rPr>
-              <w:t>1.95m</w:t>
-            </w:r>
-          </w:p>
-        </w:tc>
-        <w:tc>
-          <w:tcPr>
-            <w:tcW w:w="2131" w:type="dxa"/>
-          </w:tcPr>
-          <w:p>
-            <w:pPr>
-              <w:jc w:val="both"/>
-              <w:rPr>
-                <w:rFonts w:hint="default" w:ascii="sans-serif" w:hAnsi="sans-serif" w:eastAsia="sans-serif" w:cs="sans-serif"/>
-                <w:i w:val="0"/>
-                <w:iCs w:val="0"/>
-                <w:caps w:val="0"/>
-                <w:color w:val="1F1F1F"/>
-                <w:spacing w:val="0"/>
-                <w:sz w:val="19"/>
-                <w:szCs w:val="19"/>
-                <w:shd w:val="clear" w:fill="FFFFFF"/>
-                <w:vertAlign w:val="baseline"/>
-                <w:lang w:val="en-US" w:eastAsia="zh-CN"/>
-              </w:rPr>
-            </w:pPr>
-            <w:r>
-              <w:rPr>
-                <w:rFonts w:hint="eastAsia" w:ascii="sans-serif" w:hAnsi="sans-serif" w:eastAsia="sans-serif" w:cs="sans-serif"/>
-                <w:i w:val="0"/>
-                <w:iCs w:val="0"/>
-                <w:caps w:val="0"/>
-                <w:color w:val="1F1F1F"/>
-                <w:spacing w:val="0"/>
-                <w:sz w:val="19"/>
-                <w:szCs w:val="19"/>
-                <w:shd w:val="clear" w:fill="FFFFFF"/>
-                <w:vertAlign w:val="baseline"/>
-                <w:lang w:val="en-US" w:eastAsia="zh-CN"/>
-              </w:rPr>
-              <w:t>22.0%</w:t>
-            </w:r>
-          </w:p>
-        </w:tc>
-      </w:tr>
-      <w:tr>
-        <w:tblPrEx>
-          <w:tblBorders>
-            <w:top w:val="single" w:color="auto" w:sz="4" w:space="0"/>
-            <w:left w:val="single" w:color="auto" w:sz="4" w:space="0"/>
-            <w:bottom w:val="single" w:color="auto" w:sz="4" w:space="0"/>
-            <w:right w:val="single" w:color="auto" w:sz="4" w:space="0"/>
-            <w:insideH w:val="single" w:color="auto" w:sz="4" w:space="0"/>
-            <w:insideV w:val="single" w:color="auto" w:sz="4" w:space="0"/>
-          </w:tblBorders>
-          <w:tblCellMar>
-            <w:left w:w="108" w:type="dxa"/>
-            <w:right w:w="108" w:type="dxa"/>
-          </w:tblCellMar>
-        </w:tblPrEx>
-        <w:tc>
-          <w:tcPr>
-            <w:tcW w:w="2216" w:type="dxa"/>
-          </w:tcPr>
-          <w:p>
-            <w:pPr>
-              <w:jc w:val="both"/>
-              <w:rPr>
-                <w:rFonts w:hint="default" w:ascii="sans-serif" w:hAnsi="sans-serif" w:eastAsia="sans-serif" w:cs="sans-serif"/>
-                <w:i w:val="0"/>
-                <w:iCs w:val="0"/>
-                <w:caps w:val="0"/>
-                <w:color w:val="1F1F1F"/>
-                <w:spacing w:val="0"/>
-                <w:sz w:val="19"/>
-                <w:szCs w:val="19"/>
-                <w:shd w:val="clear" w:fill="FFFFFF"/>
-                <w:vertAlign w:val="baseline"/>
-                <w:lang w:val="en-US" w:eastAsia="zh-CN"/>
-              </w:rPr>
-            </w:pPr>
-            <w:r>
-              <w:rPr>
-                <w:rFonts w:ascii="sans-serif" w:hAnsi="sans-serif" w:eastAsia="sans-serif" w:cs="sans-serif"/>
-                <w:i w:val="0"/>
-                <w:iCs w:val="0"/>
-                <w:caps w:val="0"/>
-                <w:color w:val="1F1F1F"/>
-                <w:spacing w:val="0"/>
-                <w:sz w:val="19"/>
-                <w:szCs w:val="19"/>
-                <w:shd w:val="clear" w:fill="FFFFFF"/>
-              </w:rPr>
-              <w:t>High</w:t>
-            </w:r>
-            <w:r>
-              <w:rPr>
-                <w:rFonts w:hint="eastAsia" w:ascii="sans-serif" w:hAnsi="sans-serif" w:eastAsia="宋体" w:cs="sans-serif"/>
-                <w:i w:val="0"/>
-                <w:iCs w:val="0"/>
-                <w:caps w:val="0"/>
-                <w:color w:val="1F1F1F"/>
-                <w:spacing w:val="0"/>
-                <w:sz w:val="19"/>
-                <w:szCs w:val="19"/>
-                <w:shd w:val="clear" w:fill="FFFFFF"/>
-                <w:lang w:val="en-US" w:eastAsia="zh-CN"/>
-              </w:rPr>
-              <w:t xml:space="preserve"> </w:t>
-            </w:r>
-            <w:r>
-              <w:rPr>
-                <w:rFonts w:ascii="sans-serif" w:hAnsi="sans-serif" w:eastAsia="sans-serif" w:cs="sans-serif"/>
-                <w:i w:val="0"/>
-                <w:iCs w:val="0"/>
-                <w:caps w:val="0"/>
-                <w:color w:val="1F1F1F"/>
-                <w:spacing w:val="0"/>
-                <w:sz w:val="19"/>
-                <w:szCs w:val="19"/>
-                <w:shd w:val="clear" w:fill="FFFFFF"/>
-              </w:rPr>
-              <w:t>Dynamic(Severe NLOS)</w:t>
-            </w:r>
-          </w:p>
-        </w:tc>
-        <w:tc>
-          <w:tcPr>
-            <w:tcW w:w="2044" w:type="dxa"/>
-          </w:tcPr>
-          <w:p>
-            <w:pPr>
-              <w:jc w:val="both"/>
-              <w:rPr>
-                <w:rFonts w:hint="default" w:ascii="sans-serif" w:hAnsi="sans-serif" w:eastAsia="sans-serif" w:cs="sans-serif"/>
-                <w:i w:val="0"/>
-                <w:iCs w:val="0"/>
-                <w:caps w:val="0"/>
-                <w:color w:val="1F1F1F"/>
-                <w:spacing w:val="0"/>
-                <w:sz w:val="19"/>
-                <w:szCs w:val="19"/>
-                <w:shd w:val="clear" w:fill="FFFFFF"/>
-                <w:vertAlign w:val="baseline"/>
-                <w:lang w:val="en-US" w:eastAsia="zh-CN"/>
-              </w:rPr>
-            </w:pPr>
-            <w:r>
-              <w:rPr>
-                <w:rFonts w:hint="eastAsia" w:ascii="sans-serif" w:hAnsi="sans-serif" w:eastAsia="sans-serif" w:cs="sans-serif"/>
-                <w:i w:val="0"/>
-                <w:iCs w:val="0"/>
-                <w:caps w:val="0"/>
-                <w:color w:val="1F1F1F"/>
-                <w:spacing w:val="0"/>
-                <w:sz w:val="19"/>
-                <w:szCs w:val="19"/>
-                <w:shd w:val="clear" w:fill="FFFFFF"/>
-                <w:vertAlign w:val="baseline"/>
-                <w:lang w:val="en-US" w:eastAsia="zh-CN"/>
-              </w:rPr>
-              <w:t>5.25m</w:t>
-            </w:r>
-          </w:p>
-        </w:tc>
-        <w:tc>
-          <w:tcPr>
-            <w:tcW w:w="2131" w:type="dxa"/>
-          </w:tcPr>
-          <w:p>
-            <w:pPr>
-              <w:jc w:val="both"/>
-              <w:rPr>
-                <w:rFonts w:hint="default" w:ascii="sans-serif" w:hAnsi="sans-serif" w:eastAsia="sans-serif" w:cs="sans-serif"/>
-                <w:i w:val="0"/>
-                <w:iCs w:val="0"/>
-                <w:caps w:val="0"/>
-                <w:color w:val="1F1F1F"/>
-                <w:spacing w:val="0"/>
-                <w:sz w:val="19"/>
-                <w:szCs w:val="19"/>
-                <w:shd w:val="clear" w:fill="FFFFFF"/>
-                <w:vertAlign w:val="baseline"/>
-                <w:lang w:val="en-US" w:eastAsia="zh-CN"/>
-              </w:rPr>
-            </w:pPr>
-            <w:r>
-              <w:rPr>
-                <w:rFonts w:hint="eastAsia" w:ascii="sans-serif" w:hAnsi="sans-serif" w:eastAsia="sans-serif" w:cs="sans-serif"/>
-                <w:i w:val="0"/>
-                <w:iCs w:val="0"/>
-                <w:caps w:val="0"/>
-                <w:color w:val="1F1F1F"/>
-                <w:spacing w:val="0"/>
-                <w:sz w:val="19"/>
-                <w:szCs w:val="19"/>
-                <w:shd w:val="clear" w:fill="FFFFFF"/>
-                <w:vertAlign w:val="baseline"/>
-                <w:lang w:val="en-US" w:eastAsia="zh-CN"/>
-              </w:rPr>
-              <w:t>3.40m</w:t>
-            </w:r>
-          </w:p>
-        </w:tc>
-        <w:tc>
-          <w:tcPr>
-            <w:tcW w:w="2131" w:type="dxa"/>
-          </w:tcPr>
-          <w:p>
-            <w:pPr>
-              <w:jc w:val="both"/>
-              <w:rPr>
-                <w:rFonts w:hint="default" w:ascii="sans-serif" w:hAnsi="sans-serif" w:eastAsia="sans-serif" w:cs="sans-serif"/>
-                <w:i w:val="0"/>
-                <w:iCs w:val="0"/>
-                <w:caps w:val="0"/>
-                <w:color w:val="1F1F1F"/>
-                <w:spacing w:val="0"/>
-                <w:sz w:val="19"/>
-                <w:szCs w:val="19"/>
-                <w:shd w:val="clear" w:fill="FFFFFF"/>
-                <w:vertAlign w:val="baseline"/>
-                <w:lang w:val="en-US" w:eastAsia="zh-CN"/>
-              </w:rPr>
-            </w:pPr>
-            <w:r>
-              <w:rPr>
-                <w:rFonts w:hint="eastAsia" w:ascii="sans-serif" w:hAnsi="sans-serif" w:eastAsia="sans-serif" w:cs="sans-serif"/>
-                <w:i w:val="0"/>
-                <w:iCs w:val="0"/>
-                <w:caps w:val="0"/>
-                <w:color w:val="1F1F1F"/>
-                <w:spacing w:val="0"/>
-                <w:sz w:val="19"/>
-                <w:szCs w:val="19"/>
-                <w:shd w:val="clear" w:fill="FFFFFF"/>
-                <w:vertAlign w:val="baseline"/>
-                <w:lang w:val="en-US" w:eastAsia="zh-CN"/>
-              </w:rPr>
-              <w:t>35.2%</w:t>
-            </w:r>
-          </w:p>
-        </w:tc>
-      </w:tr>
-    </w:tbl>
-    <w:p>
-      <w:pPr>
-        <w:jc w:val="center"/>
-        <w:rPr>
-          <w:rFonts w:hint="default" w:ascii="sans-serif" w:hAnsi="sans-serif" w:eastAsia="sans-serif" w:cs="sans-serif"/>
-          <w:i w:val="0"/>
-          <w:iCs w:val="0"/>
-          <w:caps w:val="0"/>
-          <w:color w:val="1F1F1F"/>
-          <w:spacing w:val="0"/>
-          <w:sz w:val="19"/>
-          <w:szCs w:val="19"/>
-          <w:shd w:val="clear" w:fill="FFFFFF"/>
-        </w:rPr>
-      </w:pPr>
-      <w:r>
-        <w:rPr>
-          <w:rFonts w:hint="default" w:ascii="sans-serif" w:hAnsi="sans-serif" w:eastAsia="sans-serif" w:cs="sans-serif"/>
-          <w:i w:val="0"/>
-          <w:iCs w:val="0"/>
-          <w:caps w:val="0"/>
-          <w:color w:val="1F1F1F"/>
-          <w:spacing w:val="0"/>
-          <w:sz w:val="19"/>
-          <w:szCs w:val="19"/>
-          <w:shd w:val="clear" w:fill="FFFFFF"/>
-        </w:rPr>
-        <w:t>Table 2: Trajectory Tracking RMSE across dynamic environmental blockages</w:t>
+        <w:t xml:space="preserve"> Multi-modal perception was evaluated on the RADIATE tiny foggy sample using frame-level object-count regression error.</w:t>
+      </w:r>
+      <w:r>
+        <w:rPr>
+          <w:rFonts w:hint="default" w:ascii="sans-serif" w:hAnsi="sans-serif" w:eastAsia="sans-serif" w:cs="sans-serif"/>
+          <w:i w:val="0"/>
+          <w:iCs w:val="0"/>
+          <w:caps w:val="0"/>
+          <w:color w:val="1F1F1F"/>
+          <w:spacing w:val="0"/>
+          <w:sz w:val="19"/>
+          <w:szCs w:val="19"/>
+          <w:shd w:val="clear" w:fill="FFFFFF"/>
+          <w:lang w:val="en-US" w:eastAsia="zh-CN"/>
+        </w:rPr>
+        <w:br w:type="textWrapping"/>
+      </w:r>
+      <w:r>
+        <w:rPr>
+          <w:rFonts w:hint="default" w:ascii="sans-serif" w:hAnsi="sans-serif" w:eastAsia="sans-serif" w:cs="sans-serif"/>
+          <w:i w:val="0"/>
+          <w:iCs w:val="0"/>
+          <w:caps w:val="0"/>
+          <w:color w:val="1F1F1F"/>
+          <w:spacing w:val="0"/>
+          <w:sz w:val="19"/>
+          <w:szCs w:val="19"/>
+          <w:shd w:val="clear" w:fill="FFFFFF"/>
+          <w:lang w:val="en-US" w:eastAsia="zh-CN"/>
+        </w:rPr>
+        <w:t>RADIATE tiny foggy radar-camera experiment:</w:t>
       </w:r>
     </w:p>
     <w:p>
@@ -7024,6 +5980,130 @@
       </w:pPr>
       <w:r>
         <w:rPr>
+          <w:rFonts w:hint="default" w:ascii="sans-serif" w:hAnsi="sans-serif" w:eastAsia="sans-serif" w:cs="sans-serif"/>
+          <w:i w:val="0"/>
+          <w:iCs w:val="0"/>
+          <w:caps w:val="0"/>
+          <w:color w:val="1F1F1F"/>
+          <w:spacing w:val="0"/>
+          <w:sz w:val="19"/>
+          <w:szCs w:val="19"/>
+          <w:shd w:val="clear" w:fill="FFFFFF"/>
+          <w:lang w:val="en-US" w:eastAsia="zh-CN"/>
+        </w:rPr>
+        <w:t>- Camera-only MAE: 0.176</w:t>
+      </w:r>
+    </w:p>
+    <w:p>
+      <w:pPr>
+        <w:jc w:val="both"/>
+        <w:rPr>
+          <w:rFonts w:hint="default" w:ascii="sans-serif" w:hAnsi="sans-serif" w:eastAsia="sans-serif" w:cs="sans-serif"/>
+          <w:i w:val="0"/>
+          <w:iCs w:val="0"/>
+          <w:caps w:val="0"/>
+          <w:color w:val="1F1F1F"/>
+          <w:spacing w:val="0"/>
+          <w:sz w:val="19"/>
+          <w:szCs w:val="19"/>
+          <w:shd w:val="clear" w:fill="FFFFFF"/>
+        </w:rPr>
+      </w:pPr>
+      <w:r>
+        <w:rPr>
+          <w:rFonts w:hint="default" w:ascii="sans-serif" w:hAnsi="sans-serif" w:eastAsia="sans-serif" w:cs="sans-serif"/>
+          <w:i w:val="0"/>
+          <w:iCs w:val="0"/>
+          <w:caps w:val="0"/>
+          <w:color w:val="1F1F1F"/>
+          <w:spacing w:val="0"/>
+          <w:sz w:val="19"/>
+          <w:szCs w:val="19"/>
+          <w:shd w:val="clear" w:fill="FFFFFF"/>
+          <w:lang w:val="en-US" w:eastAsia="zh-CN"/>
+        </w:rPr>
+        <w:t>- Radar-only MAE: 0.566</w:t>
+      </w:r>
+    </w:p>
+    <w:p>
+      <w:pPr>
+        <w:jc w:val="both"/>
+        <w:rPr>
+          <w:rFonts w:hint="default" w:ascii="sans-serif" w:hAnsi="sans-serif" w:eastAsia="sans-serif" w:cs="sans-serif"/>
+          <w:i w:val="0"/>
+          <w:iCs w:val="0"/>
+          <w:caps w:val="0"/>
+          <w:color w:val="1F1F1F"/>
+          <w:spacing w:val="0"/>
+          <w:sz w:val="19"/>
+          <w:szCs w:val="19"/>
+          <w:shd w:val="clear" w:fill="FFFFFF"/>
+        </w:rPr>
+      </w:pPr>
+      <w:r>
+        <w:rPr>
+          <w:rFonts w:hint="default" w:ascii="sans-serif" w:hAnsi="sans-serif" w:eastAsia="sans-serif" w:cs="sans-serif"/>
+          <w:i w:val="0"/>
+          <w:iCs w:val="0"/>
+          <w:caps w:val="0"/>
+          <w:color w:val="1F1F1F"/>
+          <w:spacing w:val="0"/>
+          <w:sz w:val="19"/>
+          <w:szCs w:val="19"/>
+          <w:shd w:val="clear" w:fill="FFFFFF"/>
+          <w:lang w:val="en-US" w:eastAsia="zh-CN"/>
+        </w:rPr>
+        <w:t>- Fusion MAE: 0.402</w:t>
+      </w:r>
+    </w:p>
+    <w:p>
+      <w:pPr>
+        <w:jc w:val="both"/>
+        <w:rPr>
+          <w:rFonts w:hint="default" w:ascii="sans-serif" w:hAnsi="sans-serif" w:eastAsia="sans-serif" w:cs="sans-serif"/>
+          <w:i w:val="0"/>
+          <w:iCs w:val="0"/>
+          <w:caps w:val="0"/>
+          <w:color w:val="1F1F1F"/>
+          <w:spacing w:val="0"/>
+          <w:sz w:val="19"/>
+          <w:szCs w:val="19"/>
+          <w:shd w:val="clear" w:fill="FFFFFF"/>
+        </w:rPr>
+      </w:pPr>
+      <w:r>
+        <w:rPr>
+          <w:rFonts w:hint="default" w:ascii="sans-serif" w:hAnsi="sans-serif" w:eastAsia="sans-serif" w:cs="sans-serif"/>
+          <w:i w:val="0"/>
+          <w:iCs w:val="0"/>
+          <w:caps w:val="0"/>
+          <w:color w:val="1F1F1F"/>
+          <w:spacing w:val="0"/>
+          <w:sz w:val="19"/>
+          <w:szCs w:val="19"/>
+          <w:shd w:val="clear" w:fill="FFFFFF"/>
+          <w:lang w:val="en-US" w:eastAsia="zh-CN"/>
+        </w:rPr>
+        <w:t>- Best modality: camera-only</w:t>
+      </w:r>
+    </w:p>
+    <w:p>
+      <w:pPr>
+        <w:jc w:val="both"/>
+        <w:rPr>
+          <w:rFonts w:hint="default" w:ascii="sans-serif" w:hAnsi="sans-serif" w:eastAsia="sans-serif" w:cs="sans-serif"/>
+          <w:i w:val="0"/>
+          <w:iCs w:val="0"/>
+          <w:caps w:val="0"/>
+          <w:color w:val="1F1F1F"/>
+          <w:spacing w:val="0"/>
+          <w:sz w:val="19"/>
+          <w:szCs w:val="19"/>
+          <w:shd w:val="clear" w:fill="FFFFFF"/>
+        </w:rPr>
+      </w:pPr>
+      <w:r>
+        <w:rPr>
           <w:rFonts w:ascii="sans-serif" w:hAnsi="sans-serif" w:eastAsia="sans-serif" w:cs="sans-serif"/>
           <w:b/>
           <w:bCs/>
@@ -7050,7 +6130,50 @@
           <w:szCs w:val="19"/>
           <w:shd w:val="clear" w:fill="FFFFFF"/>
         </w:rPr>
-        <w:t xml:space="preserve"> As demonstrated, the ISCSC-MoE framework significantly outperforms existing architectures. In high-dynamic, severely occluded environments (Table 2), the MoE dynamically shifted reliance to the RF sensing experts, yielding an unprecedented 3.40m RMSE. Furthermore, the CSI-assisted RoI extraction achieved a 94.5% reduction in raw data transmission volume, easily satisfying the strict ultra-low latency constraints of edge-IoT systems.</w:t>
+        <w:t xml:space="preserve"> As demonstrated, The current results partially support the channel-aware resource slicing component, but do not yet validate the full multi-modal fusion superiority claim. In the RADIATE tiny foggy sample, camera-only features achieved lower object-count regression error than radar-only and naive fusion features. Furthermore, </w:t>
+      </w:r>
+      <w:r>
+        <w:rPr>
+          <w:rFonts w:hint="eastAsia" w:ascii="sans-serif" w:hAnsi="sans-serif" w:eastAsia="宋体" w:cs="sans-serif"/>
+          <w:i w:val="0"/>
+          <w:iCs w:val="0"/>
+          <w:caps w:val="0"/>
+          <w:color w:val="1F1F1F"/>
+          <w:spacing w:val="0"/>
+          <w:sz w:val="19"/>
+          <w:szCs w:val="19"/>
+          <w:shd w:val="clear" w:fill="FFFFFF"/>
+          <w:lang w:val="en-US" w:eastAsia="zh-CN"/>
+        </w:rPr>
+        <w:t>t</w:t>
+      </w:r>
+      <w:r>
+        <w:rPr>
+          <w:rFonts w:hint="default" w:ascii="sans-serif" w:hAnsi="sans-serif" w:eastAsia="sans-serif" w:cs="sans-serif"/>
+          <w:i w:val="0"/>
+          <w:iCs w:val="0"/>
+          <w:caps w:val="0"/>
+          <w:color w:val="1F1F1F"/>
+          <w:spacing w:val="0"/>
+          <w:sz w:val="19"/>
+          <w:szCs w:val="19"/>
+          <w:shd w:val="clear" w:fill="FFFFFF"/>
+        </w:rPr>
+        <w:t>he CSI-assisted RoI extraction remains a design objective and has not yet been validated in the current tiny-data experiments.</w:t>
+      </w:r>
+      <w:r>
+        <w:rPr>
+          <w:rFonts w:hint="default" w:ascii="sans-serif" w:hAnsi="sans-serif" w:eastAsia="sans-serif" w:cs="sans-serif"/>
+          <w:i w:val="0"/>
+          <w:iCs w:val="0"/>
+          <w:caps w:val="0"/>
+          <w:color w:val="1F1F1F"/>
+          <w:spacing w:val="0"/>
+          <w:sz w:val="19"/>
+          <w:szCs w:val="19"/>
+          <w:shd w:val="clear" w:fill="FFFFFF"/>
+        </w:rPr>
+        <w:t>The SER value is a proxy derived from ray-tracing channel quality rather than an over-the-air semantic communication measurement.</w:t>
       </w:r>
     </w:p>
     <w:p>
@@ -7094,6 +6217,93 @@
     </w:p>
     <w:p>
       <w:pPr>
+        <w:pStyle w:val="3"/>
+        <w:keepNext w:val="0"/>
+        <w:keepLines w:val="0"/>
+        <w:widowControl/>
+        <w:suppressLineNumbers w:val="0"/>
+        <w:shd w:val="clear" w:fill="FFFFFF"/>
+        <w:ind w:left="0" w:firstLine="0"/>
+        <w:rPr>
+          <w:rFonts w:hint="eastAsia" w:ascii="sans-serif" w:hAnsi="sans-serif" w:eastAsia="sans-serif" w:cs="sans-serif"/>
+          <w:b w:val="0"/>
+          <w:bCs w:val="0"/>
+          <w:i w:val="0"/>
+          <w:iCs w:val="0"/>
+          <w:caps w:val="0"/>
+          <w:color w:val="1F1F1F"/>
+          <w:spacing w:val="0"/>
+          <w:kern w:val="2"/>
+          <w:sz w:val="19"/>
+          <w:szCs w:val="19"/>
+          <w:shd w:val="clear" w:fill="FFFFFF"/>
+          <w:lang w:val="en-US" w:eastAsia="zh-CN" w:bidi="ar-SA"/>
+        </w:rPr>
+      </w:pPr>
+      <w:r>
+        <w:rPr>
+          <w:rFonts w:hint="eastAsia" w:ascii="sans-serif" w:hAnsi="sans-serif" w:eastAsia="sans-serif" w:cs="sans-serif"/>
+          <w:b w:val="0"/>
+          <w:bCs w:val="0"/>
+          <w:i w:val="0"/>
+          <w:iCs w:val="0"/>
+          <w:caps w:val="0"/>
+          <w:color w:val="1F1F1F"/>
+          <w:spacing w:val="0"/>
+          <w:kern w:val="2"/>
+          <w:sz w:val="19"/>
+          <w:szCs w:val="19"/>
+          <w:shd w:val="clear" w:fill="FFFFFF"/>
+          <w:lang w:val="en-US" w:eastAsia="zh-CN" w:bidi="ar-SA"/>
+        </w:rPr>
+        <w:t>This proposal presents a feasible architecture for integrating semantic communication, RF sensing, and edge intelligence. Current small-scale public-data experiments suggest that channel-aware semantic slicing is promising, while the multi-modal fusion component requires further validation on larger synchronized datasets such as RADIATE full sequences, CARRADA, Multimodal-Wireless, or Sensiverse.</w:t>
+      </w:r>
+    </w:p>
+    <w:p>
+      <w:pPr>
+        <w:pStyle w:val="3"/>
+        <w:keepNext w:val="0"/>
+        <w:keepLines w:val="0"/>
+        <w:widowControl/>
+        <w:suppressLineNumbers w:val="0"/>
+        <w:shd w:val="clear" w:fill="FFFFFF"/>
+        <w:ind w:left="0" w:firstLine="0"/>
+        <w:rPr>
+          <w:rFonts w:ascii="sans-serif" w:hAnsi="sans-serif" w:eastAsia="sans-serif" w:cs="sans-serif"/>
+          <w:b/>
+          <w:bCs/>
+          <w:i w:val="0"/>
+          <w:iCs w:val="0"/>
+          <w:caps w:val="0"/>
+          <w:color w:val="1F1F1F"/>
+          <w:spacing w:val="0"/>
+          <w:sz w:val="24"/>
+          <w:szCs w:val="24"/>
+        </w:rPr>
+      </w:pPr>
+      <w:r>
+        <w:rPr>
+          <w:rFonts w:hint="default" w:ascii="sans-serif" w:hAnsi="sans-serif" w:eastAsia="sans-serif" w:cs="sans-serif"/>
+          <w:b/>
+          <w:bCs/>
+          <w:i w:val="0"/>
+          <w:iCs w:val="0"/>
+          <w:caps w:val="0"/>
+          <w:color w:val="1F1F1F"/>
+          <w:spacing w:val="0"/>
+          <w:sz w:val="24"/>
+          <w:szCs w:val="24"/>
+          <w:shd w:val="clear" w:fill="FFFFFF"/>
+        </w:rPr>
+        <w:t>References</w:t>
+      </w:r>
+    </w:p>
+    <w:p>
+      <w:pPr>
+        <w:numPr>
+          <w:ilvl w:val="0"/>
+          <w:numId w:val="0"/>
+        </w:numPr>
         <w:jc w:val="both"/>
         <w:rPr>
           <w:rFonts w:hint="default" w:ascii="sans-serif" w:hAnsi="sans-serif" w:eastAsia="sans-serif" w:cs="sans-serif"/>
@@ -7105,11 +6315,26 @@
           <w:sz w:val="19"/>
           <w:szCs w:val="19"/>
           <w:shd w:val="clear" w:fill="FFFFFF"/>
-          <w:lang w:val="en-US" w:eastAsia="zh-CN"/>
         </w:rPr>
       </w:pPr>
       <w:r>
         <w:rPr>
+          <w:rFonts w:hint="default" w:ascii="sans-serif" w:hAnsi="sans-serif" w:eastAsia="sans-serif" w:cs="sans-serif"/>
+          <w:i w:val="0"/>
+          <w:iCs w:val="0"/>
+          <w:caps w:val="0"/>
+          <w:color w:val="1F1F1F"/>
+          <w:spacing w:val="0"/>
+          <w:kern w:val="2"/>
+          <w:sz w:val="19"/>
+          <w:szCs w:val="19"/>
+          <w:shd w:val="clear" w:fill="FFFFFF"/>
+          <w:lang w:val="en-US" w:eastAsia="zh-CN" w:bidi="ar-SA"/>
+        </w:rPr>
+        <w:t>Y.</w:t>
+      </w:r>
+      <w:r>
+        <w:rPr>
           <w:rFonts w:ascii="sans-serif" w:hAnsi="sans-serif" w:eastAsia="sans-serif" w:cs="sans-serif"/>
           <w:i w:val="0"/>
           <w:iCs w:val="0"/>
@@ -7120,10 +6345,280 @@
           <w:szCs w:val="19"/>
           <w:shd w:val="clear" w:fill="FFFFFF"/>
         </w:rPr>
-        <w:t>This proposal provides a mathematically rigorous, expert-driven ISCSC architecture that actively bridges the disjointed domains of physical-layer ISAC and task-oriented semantic communication. By dynamically aligning cross-modal features and utilizing Alternating Optimization for resource slicing, the proposed framework solves critical systemic bottlenecks, proving its feasibility for mission-critical 6G IoT deployments.</w:t>
-      </w:r>
-      <w:bookmarkStart w:id="0" w:name="_GoBack"/>
-      <w:bookmarkEnd w:id="0"/>
+        <w:t xml:space="preserve">He, "Task-Oriented Integrated Sensing and Semantic Communications for Multi-Device Video Analytics," </w:t>
+      </w:r>
+      <w:r>
+        <w:rPr>
+          <w:rFonts w:hint="default" w:ascii="sans-serif" w:hAnsi="sans-serif" w:eastAsia="sans-serif" w:cs="sans-serif"/>
+          <w:i/>
+          <w:iCs/>
+          <w:caps w:val="0"/>
+          <w:color w:val="1F1F1F"/>
+          <w:spacing w:val="0"/>
+          <w:sz w:val="19"/>
+          <w:szCs w:val="19"/>
+          <w:shd w:val="clear" w:fill="FFFFFF"/>
+        </w:rPr>
+        <w:t>IEEE Transactions on Mobile Computing</w:t>
+      </w:r>
+      <w:r>
+        <w:rPr>
+          <w:rFonts w:hint="default" w:ascii="sans-serif" w:hAnsi="sans-serif" w:eastAsia="sans-serif" w:cs="sans-serif"/>
+          <w:i w:val="0"/>
+          <w:iCs w:val="0"/>
+          <w:caps w:val="0"/>
+          <w:color w:val="1F1F1F"/>
+          <w:spacing w:val="0"/>
+          <w:sz w:val="19"/>
+          <w:szCs w:val="19"/>
+          <w:shd w:val="clear" w:fill="FFFFFF"/>
+        </w:rPr>
+        <w:t>, pp. 1-14, Dec. 2025.</w:t>
+      </w:r>
+    </w:p>
+    <w:p>
+      <w:pPr>
+        <w:numPr>
+          <w:ilvl w:val="0"/>
+          <w:numId w:val="0"/>
+        </w:numPr>
+        <w:ind w:left="0" w:leftChars="0" w:firstLine="0" w:firstLineChars="0"/>
+        <w:jc w:val="both"/>
+        <w:rPr>
+          <w:rFonts w:hint="default" w:ascii="sans-serif" w:hAnsi="sans-serif" w:eastAsia="sans-serif" w:cs="sans-serif"/>
+          <w:i w:val="0"/>
+          <w:iCs w:val="0"/>
+          <w:caps w:val="0"/>
+          <w:color w:val="1F1F1F"/>
+          <w:spacing w:val="0"/>
+          <w:sz w:val="19"/>
+          <w:szCs w:val="19"/>
+          <w:shd w:val="clear" w:fill="FFFFFF"/>
+        </w:rPr>
+      </w:pPr>
+      <w:r>
+        <w:rPr>
+          <w:rFonts w:hint="default" w:ascii="sans-serif" w:hAnsi="sans-serif" w:eastAsia="sans-serif" w:cs="sans-serif"/>
+          <w:i w:val="0"/>
+          <w:iCs w:val="0"/>
+          <w:caps w:val="0"/>
+          <w:color w:val="1F1F1F"/>
+          <w:spacing w:val="0"/>
+          <w:kern w:val="2"/>
+          <w:sz w:val="19"/>
+          <w:szCs w:val="19"/>
+          <w:shd w:val="clear" w:fill="FFFFFF"/>
+          <w:lang w:val="en-US" w:eastAsia="zh-CN" w:bidi="ar-SA"/>
+        </w:rPr>
+        <w:t>Z.</w:t>
+      </w:r>
+      <w:r>
+        <w:rPr>
+          <w:rFonts w:ascii="sans-serif" w:hAnsi="sans-serif" w:eastAsia="sans-serif" w:cs="sans-serif"/>
+          <w:i w:val="0"/>
+          <w:iCs w:val="0"/>
+          <w:caps w:val="0"/>
+          <w:color w:val="1F1F1F"/>
+          <w:spacing w:val="0"/>
+          <w:sz w:val="19"/>
+          <w:szCs w:val="19"/>
+          <w:shd w:val="clear" w:fill="FFFFFF"/>
+        </w:rPr>
+        <w:t xml:space="preserve">Yang, et al., "Integrated Sensing, Computing, and Semantic Communication with Fluid Antenna for Metaverse," </w:t>
+      </w:r>
+      <w:r>
+        <w:rPr>
+          <w:rFonts w:hint="default" w:ascii="sans-serif" w:hAnsi="sans-serif" w:eastAsia="sans-serif" w:cs="sans-serif"/>
+          <w:i/>
+          <w:iCs/>
+          <w:caps w:val="0"/>
+          <w:color w:val="1F1F1F"/>
+          <w:spacing w:val="0"/>
+          <w:sz w:val="19"/>
+          <w:szCs w:val="19"/>
+          <w:shd w:val="clear" w:fill="FFFFFF"/>
+        </w:rPr>
+        <w:t>arXiv preprint arXiv:2504.07656</w:t>
+      </w:r>
+      <w:r>
+        <w:rPr>
+          <w:rFonts w:hint="default" w:ascii="sans-serif" w:hAnsi="sans-serif" w:eastAsia="sans-serif" w:cs="sans-serif"/>
+          <w:i w:val="0"/>
+          <w:iCs w:val="0"/>
+          <w:caps w:val="0"/>
+          <w:color w:val="1F1F1F"/>
+          <w:spacing w:val="0"/>
+          <w:sz w:val="19"/>
+          <w:szCs w:val="19"/>
+          <w:shd w:val="clear" w:fill="FFFFFF"/>
+        </w:rPr>
+        <w:t>, Apr. 2025.</w:t>
+      </w:r>
+    </w:p>
+    <w:p>
+      <w:pPr>
+        <w:numPr>
+          <w:numId w:val="0"/>
+        </w:numPr>
+        <w:ind w:leftChars="0"/>
+        <w:jc w:val="both"/>
+        <w:rPr>
+          <w:rFonts w:hint="default" w:ascii="sans-serif" w:hAnsi="sans-serif" w:eastAsia="sans-serif" w:cs="sans-serif"/>
+          <w:i w:val="0"/>
+          <w:iCs w:val="0"/>
+          <w:caps w:val="0"/>
+          <w:color w:val="1F1F1F"/>
+          <w:spacing w:val="0"/>
+          <w:sz w:val="19"/>
+          <w:szCs w:val="19"/>
+          <w:shd w:val="clear" w:fill="FFFFFF"/>
+          <w:lang w:val="en-US" w:eastAsia="zh-CN"/>
+        </w:rPr>
+      </w:pPr>
+      <w:r>
+        <w:rPr>
+          <w:rFonts w:hint="default" w:ascii="sans-serif" w:hAnsi="sans-serif" w:eastAsia="sans-serif" w:cs="sans-serif"/>
+          <w:i w:val="0"/>
+          <w:iCs w:val="0"/>
+          <w:caps w:val="0"/>
+          <w:color w:val="1F1F1F"/>
+          <w:spacing w:val="0"/>
+          <w:sz w:val="19"/>
+          <w:szCs w:val="19"/>
+          <w:shd w:val="clear" w:fill="FFFFFF"/>
+          <w:lang w:val="en-US" w:eastAsia="zh-CN"/>
+        </w:rPr>
+        <w:t xml:space="preserve">Karahan, S.N. Hybrid ISAC-LSTM Architecture for Enhanced Target Tracking in Integrated Sensing and Communication Systems: A Symmetric Dual-Function Framework. Symmetry 2025, 17, 1725. </w:t>
+      </w:r>
+    </w:p>
+    <w:p>
+      <w:pPr>
+        <w:numPr>
+          <w:numId w:val="0"/>
+        </w:numPr>
+        <w:ind w:leftChars="0"/>
+        <w:jc w:val="both"/>
+        <w:rPr>
+          <w:rFonts w:hint="default" w:ascii="sans-serif" w:hAnsi="sans-serif" w:eastAsia="sans-serif" w:cs="sans-serif"/>
+          <w:i w:val="0"/>
+          <w:iCs w:val="0"/>
+          <w:caps w:val="0"/>
+          <w:color w:val="1F1F1F"/>
+          <w:spacing w:val="0"/>
+          <w:sz w:val="19"/>
+          <w:szCs w:val="19"/>
+          <w:shd w:val="clear" w:fill="FFFFFF"/>
+          <w:lang w:val="en-US" w:eastAsia="zh-CN"/>
+        </w:rPr>
+      </w:pPr>
+      <w:r>
+        <w:rPr>
+          <w:rFonts w:hint="default" w:ascii="sans-serif" w:hAnsi="sans-serif" w:eastAsia="sans-serif" w:cs="sans-serif"/>
+          <w:i w:val="0"/>
+          <w:iCs w:val="0"/>
+          <w:caps w:val="0"/>
+          <w:color w:val="1F1F1F"/>
+          <w:spacing w:val="0"/>
+          <w:sz w:val="19"/>
+          <w:szCs w:val="19"/>
+          <w:shd w:val="clear" w:fill="FFFFFF"/>
+          <w:lang w:val="en-US" w:eastAsia="zh-CN"/>
+        </w:rPr>
+        <w:t xml:space="preserve"> "Sensiverse: A sensing channel dataset for multi-scenario and multi-mode integrated sensing and communication," 2025.   </w:t>
+      </w:r>
+    </w:p>
+    <w:p>
+      <w:pPr>
+        <w:numPr>
+          <w:numId w:val="0"/>
+        </w:numPr>
+        <w:ind w:leftChars="0"/>
+        <w:jc w:val="both"/>
+        <w:rPr>
+          <w:rFonts w:hint="default" w:ascii="sans-serif" w:hAnsi="sans-serif" w:eastAsia="sans-serif" w:cs="sans-serif"/>
+          <w:i w:val="0"/>
+          <w:iCs w:val="0"/>
+          <w:caps w:val="0"/>
+          <w:color w:val="1F1F1F"/>
+          <w:spacing w:val="0"/>
+          <w:sz w:val="19"/>
+          <w:szCs w:val="19"/>
+          <w:shd w:val="clear" w:fill="FFFFFF"/>
+          <w:lang w:val="en-US" w:eastAsia="zh-CN"/>
+        </w:rPr>
+      </w:pPr>
+      <w:r>
+        <w:rPr>
+          <w:rFonts w:hint="default" w:ascii="sans-serif" w:hAnsi="sans-serif" w:eastAsia="sans-serif" w:cs="sans-serif"/>
+          <w:i w:val="0"/>
+          <w:iCs w:val="0"/>
+          <w:caps w:val="0"/>
+          <w:color w:val="1F1F1F"/>
+          <w:spacing w:val="0"/>
+          <w:sz w:val="19"/>
+          <w:szCs w:val="19"/>
+          <w:shd w:val="clear" w:fill="FFFFFF"/>
+          <w:lang w:val="en-US" w:eastAsia="zh-CN"/>
+        </w:rPr>
+        <w:t xml:space="preserve"> Y. Ren, et al., "Semantic-Empowered Integrated Sensing and Communication," IEEE, 2025.</w:t>
+      </w:r>
+    </w:p>
+    <w:p>
+      <w:pPr>
+        <w:numPr>
+          <w:numId w:val="0"/>
+        </w:numPr>
+        <w:ind w:leftChars="0"/>
+        <w:jc w:val="both"/>
+        <w:rPr>
+          <w:rFonts w:hint="default" w:ascii="sans-serif" w:hAnsi="sans-serif" w:eastAsia="sans-serif" w:cs="sans-serif"/>
+          <w:i w:val="0"/>
+          <w:iCs w:val="0"/>
+          <w:caps w:val="0"/>
+          <w:color w:val="1F1F1F"/>
+          <w:spacing w:val="0"/>
+          <w:sz w:val="19"/>
+          <w:szCs w:val="19"/>
+          <w:shd w:val="clear" w:fill="FFFFFF"/>
+          <w:lang w:val="en-US" w:eastAsia="zh-CN"/>
+        </w:rPr>
+      </w:pPr>
+      <w:r>
+        <w:rPr>
+          <w:rFonts w:hint="default" w:ascii="sans-serif" w:hAnsi="sans-serif" w:eastAsia="sans-serif" w:cs="sans-serif"/>
+          <w:i w:val="0"/>
+          <w:iCs w:val="0"/>
+          <w:caps w:val="0"/>
+          <w:color w:val="1F1F1F"/>
+          <w:spacing w:val="0"/>
+          <w:sz w:val="19"/>
+          <w:szCs w:val="19"/>
+          <w:shd w:val="clear" w:fill="FFFFFF"/>
+          <w:lang w:val="en-US" w:eastAsia="zh-CN"/>
+        </w:rPr>
+        <w:t xml:space="preserve"> "Target tracking in integrated sensing and communication (ISAC) systems via hybrid ISAC-LSTM architecture," MDPI, 2025.</w:t>
+      </w:r>
+    </w:p>
+    <w:p>
+      <w:pPr>
+        <w:numPr>
+          <w:numId w:val="0"/>
+        </w:numPr>
+        <w:ind w:leftChars="0"/>
+        <w:jc w:val="both"/>
+        <w:rPr>
+          <w:rFonts w:hint="default" w:ascii="sans-serif" w:hAnsi="sans-serif" w:eastAsia="sans-serif" w:cs="sans-serif"/>
+          <w:i w:val="0"/>
+          <w:iCs w:val="0"/>
+          <w:caps w:val="0"/>
+          <w:color w:val="1F1F1F"/>
+          <w:spacing w:val="0"/>
+          <w:sz w:val="19"/>
+          <w:szCs w:val="19"/>
+          <w:shd w:val="clear" w:fill="FFFFFF"/>
+          <w:lang w:val="en-US" w:eastAsia="zh-CN"/>
+        </w:rPr>
+      </w:pPr>
     </w:p>
     <w:sectPr>
       <w:pgSz w:w="11906" w:h="16838"/>

</xml_diff>